<commit_message>
Fix structural inconsistency + 3 minor issues from review
1. Three→Four hypotheses in Results: add H3 mutation trajectory
   ordering (inverted), IA becomes H4. Now Results 4 hypotheses,
   Discussion 3 considered alternatives — consistent.
2. Bare "eigenspace" → "module activity eigenspace" everywhere
3. Remove rho²=0.69 "explained variance" (invalid for Spearman)
4. Soften clinical prediction in Outlook

Co-Authored-By: Claude Opus 4.6 (1M context) <noreply@anthropic.com>
</commit_message>
<xml_diff>
--- a/Spiro_2026_Paper2_preprint.docx
+++ b/Spiro_2026_Paper2_preprint.docx
@@ -959,13 +959,13 @@
       </w:r>
     </w:p>
     <w:bookmarkEnd w:id="17"/>
-    <w:bookmarkStart w:id="18" w:name="three-architectural-hypotheses"/>
+    <w:bookmarkStart w:id="18" w:name="four-architectural-hypotheses"/>
     <w:p>
       <w:pPr>
         <w:pStyle w:val="Heading4"/>
       </w:pPr>
       <w:r>
-        <w:t xml:space="preserve">Three architectural hypotheses</w:t>
+        <w:t xml:space="preserve">Four architectural hypotheses</w:t>
       </w:r>
     </w:p>
     <w:p>
@@ -1065,7 +1065,35 @@
           <w:b/>
           <w:bCs/>
         </w:rPr>
-        <w:t xml:space="preserve">Hypothesis 3: Irreversible Authority (IA).</w:t>
+        <w:t xml:space="preserve">Hypothesis 3: Mutation trajectory ordering.</w:t>
+      </w:r>
+      <w:r>
+        <w:t xml:space="preserve"> </w:t>
+      </w:r>
+      <w:r>
+        <w:t xml:space="preserve">If cancer mutations sequentially disrupt the most vulnerable modules first, mutation order in multi-hit cancers should follow the vulnerability gradient (high to low). Empirical analysis of COSMIC mutation co-occurrence shows the inverse: accelerator modules (low IA) are mutated first, checkpoint modules (high IA) later — consistent with a sequential bypass strategy rather than top-down cascade.</w:t>
+      </w:r>
+      <w:r>
+        <w:t xml:space="preserve"> </w:t>
+      </w:r>
+      <w:r>
+        <w:rPr>
+          <w:b/>
+          <w:bCs/>
+        </w:rPr>
+        <w:t xml:space="preserve">Inverted from prediction.</w:t>
+      </w:r>
+    </w:p>
+    <w:p>
+      <w:pPr>
+        <w:pStyle w:val="BodyText"/>
+      </w:pPr>
+      <w:r>
+        <w:rPr>
+          <w:b/>
+          <w:bCs/>
+        </w:rPr>
+        <w:t xml:space="preserve">Hypothesis 4: Irreversible Authority (IA).</w:t>
       </w:r>
       <w:r>
         <w:t xml:space="preserve"> </w:t>
@@ -2637,7 +2665,7 @@
         <w:pStyle w:val="FirstParagraph"/>
       </w:pPr>
       <w:r>
-        <w:t xml:space="preserve">Part 1 establishes that NFL membership matters; Part 2 explains why some NFL modules matter more. The IA metric explains 69% of the variance (rho^2 = 0.69) in CGC fraction across 20 modules. The biological logic is straightforward: modules that control irreversible cell-fate decisions (apoptosis, terminal differentiation, DNA damage checkpoint commitment) create one-way gates in the cellular state space. Cancer must breach these gates to achieve hallmark capabilities such as resistance to cell death and replicative immortality (Hanahan, 2022). Modules controlling only reversible outcomes (circadian rhythm, metabolic switching) can be perturbed transiently without irreversible phenotypic consequences.</w:t>
+        <w:t xml:space="preserve">Part 1 establishes that NFL membership matters; Part 2 explains why some NFL modules matter more. The IA metric predicts CGC fraction across 20 modules with Spearman rho = 0.83. The biological logic is straightforward: modules that control irreversible cell-fate decisions (apoptosis, terminal differentiation, DNA damage checkpoint commitment) create one-way gates in the cellular state space. Cancer must breach these gates to achieve hallmark capabilities such as resistance to cell death and replicative immortality (Hanahan, 2022). Modules controlling only reversible outcomes (circadian rhythm, metabolic switching) can be perturbed transiently without irreversible phenotypic consequences.</w:t>
       </w:r>
     </w:p>
     <w:p>
@@ -2817,7 +2845,7 @@
         <w:pStyle w:val="FirstParagraph"/>
       </w:pPr>
       <w:r>
-        <w:t xml:space="preserve">The two-level architecture of cancer vulnerability (NFL membership + Irreversible Authority) suggests several testable predictions. First, the 7 unvalidated eigenspace cancer gene candidates (non-CGC genes in the CGC-proximal eigenspace region) represent specific predictions for cancer driver discovery. Second, perturbation of high-IA modules (p53, Wnt, Notch) should produce more irreversible phenotypic consequences than perturbation of low-IA modules (Circadian, SREBP), testable by CRISPR perturbation screens with longitudinal single-cell readouts. Third, the IA metric predicts that therapeutic strategies restoring irreversible checkpoints (e.g., MDM2 inhibitors restoring p53 apoptotic authority) should be more effective than strategies targeting reversible signaling parameters. These predictions are experimentally testable with existing tools.</w:t>
+        <w:t xml:space="preserve">The two-level architecture of cancer vulnerability (NFL membership + Irreversible Authority) suggests several testable predictions. First, the 7 unvalidated cancer gene candidates (non-CGC genes in the CGC-proximal region of the module activity eigenspace) represent specific predictions for cancer driver discovery. Second, perturbation of high-IA modules (p53, Wnt, Notch) should produce more irreversible phenotypic consequences than perturbation of low-IA modules (Circadian, SREBP), testable by CRISPR perturbation screens with longitudinal single-cell readouts. Third, the IA framework generates a testable hierarchy among existing therapeutic targets: drugs restoring high-IA checkpoint function (e.g., MDM2 inhibitors acting on the p53 module, IA = 3) should show broader efficacy than drugs targeting low-IA modules, a prediction that can be evaluated against clinical trial databases.</w:t>
       </w:r>
     </w:p>
     <w:p>
@@ -3716,7 +3744,7 @@
         <w:t xml:space="preserve"> </w:t>
       </w:r>
       <w:r>
-        <w:t xml:space="preserve">Eigenspace cancer gene candidates: 20 non-CGC genes, eigenspace coordinates, distance to CGC centroid, and IntOGen validation status.</w:t>
+        <w:t xml:space="preserve">Module activity eigenspace cancer gene candidates: 20 non-CGC genes, eigenspace coordinates, distance to CGC centroid, and IntOGen validation status.</w:t>
       </w:r>
     </w:p>
     <w:p>
@@ -3857,7 +3885,7 @@
         <w:t xml:space="preserve"> </w:t>
       </w:r>
       <w:r>
-        <w:t xml:space="preserve">(A) Scree plot: 6 Kaiser components explain 67% of variance in the 20-module x 154-cell-type expression matrix. (B) CGC genes cluster in a non-random eigenspace subregion (permutation</w:t>
+        <w:t xml:space="preserve">(A) Scree plot: 6 Kaiser components explain 67% of variance in the 20-module x 154-cell-type expression matrix. (B) CGC genes cluster in a non-random subregion of the module activity eigenspace (permutation</w:t>
       </w:r>
       <w:r>
         <w:t xml:space="preserve"> </w:t>

</xml_diff>